<commit_message>
Small updates to manuscript
</commit_message>
<xml_diff>
--- a/Documents/CoverLetterReviewerResponses-Resubmit_Rind&Rosenberg2026.docx
+++ b/Documents/CoverLetterReviewerResponses-Resubmit_Rind&Rosenberg2026.docx
@@ -552,21 +552,8 @@
           <w:sz w:val="24"/>
           <w:szCs w:val="24"/>
         </w:rPr>
-        <w:t xml:space="preserve">of </w:t>
-      </w:r>
-      <w:proofErr w:type="spellStart"/>
-      <w:r>
-        <w:rPr>
-          <w:rFonts w:asciiTheme="majorBidi" w:eastAsia="Times New Roman" w:hAnsiTheme="majorBidi" w:cstheme="majorBidi"/>
-          <w:i/>
-          <w:iCs/>
-          <w:color w:val="222222"/>
-          <w:sz w:val="24"/>
-          <w:szCs w:val="24"/>
-        </w:rPr>
-        <w:t>Hydroinformatics</w:t>
-      </w:r>
-      <w:proofErr w:type="spellEnd"/>
+        <w:t>of Hydroinformatics</w:t>
+      </w:r>
       <w:r>
         <w:rPr>
           <w:rFonts w:asciiTheme="majorBidi" w:eastAsia="Times New Roman" w:hAnsiTheme="majorBidi" w:cstheme="majorBidi"/>
@@ -664,7 +651,16 @@
           <w:sz w:val="24"/>
           <w:szCs w:val="24"/>
         </w:rPr>
-        <w:t>, and additionally added sensitivity analysis that drew on our prior work with 2014 energy prices</w:t>
+        <w:t>. We</w:t>
+      </w:r>
+      <w:r>
+        <w:rPr>
+          <w:rFonts w:asciiTheme="majorBidi" w:eastAsia="Times New Roman" w:hAnsiTheme="majorBidi" w:cstheme="majorBidi"/>
+          <w:color w:val="222222"/>
+          <w:sz w:val="24"/>
+          <w:szCs w:val="24"/>
+        </w:rPr>
+        <w:t xml:space="preserve"> additionally added sensitivity analysis that drew on our prior work with 2014 energy prices</w:t>
       </w:r>
       <w:r>
         <w:rPr>
@@ -690,15 +686,7 @@
           <w:sz w:val="24"/>
           <w:szCs w:val="24"/>
         </w:rPr>
-        <w:t xml:space="preserve">While the </w:t>
-      </w:r>
-      <w:r>
-        <w:rPr>
-          <w:rFonts w:asciiTheme="majorBidi" w:eastAsia="Times New Roman" w:hAnsiTheme="majorBidi" w:cstheme="majorBidi"/>
-          <w:sz w:val="24"/>
-          <w:szCs w:val="24"/>
-        </w:rPr>
-        <w:t xml:space="preserve">switch from 2014 to 2024 energy prices </w:t>
+        <w:t xml:space="preserve">While the switch from 2014 to 2024 energy prices </w:t>
       </w:r>
       <w:r>
         <w:rPr>
@@ -722,23 +710,23 @@
           <w:sz w:val="24"/>
           <w:szCs w:val="24"/>
         </w:rPr>
-        <w:t xml:space="preserve">ultimately, the main findings </w:t>
-      </w:r>
-      <w:r>
-        <w:rPr>
-          <w:rFonts w:asciiTheme="majorBidi" w:eastAsia="Times New Roman" w:hAnsiTheme="majorBidi" w:cstheme="majorBidi"/>
-          <w:sz w:val="24"/>
-          <w:szCs w:val="24"/>
-        </w:rPr>
-        <w:t xml:space="preserve">and qualifications </w:t>
-      </w:r>
-      <w:r>
-        <w:rPr>
-          <w:rFonts w:asciiTheme="majorBidi" w:eastAsia="Times New Roman" w:hAnsiTheme="majorBidi" w:cstheme="majorBidi"/>
-          <w:sz w:val="24"/>
-          <w:szCs w:val="24"/>
-        </w:rPr>
-        <w:t>of the paper</w:t>
+        <w:t xml:space="preserve">ultimately, the </w:t>
+      </w:r>
+      <w:r>
+        <w:rPr>
+          <w:rFonts w:asciiTheme="majorBidi" w:eastAsia="Times New Roman" w:hAnsiTheme="majorBidi" w:cstheme="majorBidi"/>
+          <w:sz w:val="24"/>
+          <w:szCs w:val="24"/>
+        </w:rPr>
+        <w:t xml:space="preserve">paper’s </w:t>
+      </w:r>
+      <w:r>
+        <w:rPr>
+          <w:rFonts w:asciiTheme="majorBidi" w:eastAsia="Times New Roman" w:hAnsiTheme="majorBidi" w:cstheme="majorBidi"/>
+          <w:sz w:val="24"/>
+          <w:szCs w:val="24"/>
+        </w:rPr>
+        <w:t>main findings</w:t>
       </w:r>
       <w:r>
         <w:rPr>
@@ -892,7 +880,15 @@
           <w:sz w:val="24"/>
           <w:szCs w:val="24"/>
         </w:rPr>
-        <w:t xml:space="preserve">reduce hydropeaking-ecosystem conflict, and </w:t>
+        <w:t>reduce hydropeaking-ecosystem conflict</w:t>
+      </w:r>
+      <w:r>
+        <w:rPr>
+          <w:rFonts w:asciiTheme="majorBidi" w:eastAsia="Times New Roman" w:hAnsiTheme="majorBidi" w:cstheme="majorBidi"/>
+          <w:sz w:val="24"/>
+          <w:szCs w:val="24"/>
+        </w:rPr>
+        <w:t>.</w:t>
       </w:r>
     </w:p>
     <w:p>
@@ -956,6 +952,53 @@
     </w:p>
     <w:p>
       <w:pPr>
+        <w:shd w:val="clear" w:color="auto" w:fill="FFFFFF"/>
+        <w:tabs>
+          <w:tab w:val="left" w:pos="916"/>
+          <w:tab w:val="left" w:pos="1832"/>
+          <w:tab w:val="left" w:pos="2748"/>
+          <w:tab w:val="left" w:pos="3664"/>
+          <w:tab w:val="left" w:pos="4580"/>
+          <w:tab w:val="left" w:pos="5496"/>
+          <w:tab w:val="left" w:pos="6412"/>
+          <w:tab w:val="left" w:pos="7328"/>
+          <w:tab w:val="left" w:pos="8244"/>
+          <w:tab w:val="left" w:pos="9160"/>
+          <w:tab w:val="left" w:pos="10076"/>
+          <w:tab w:val="left" w:pos="10992"/>
+          <w:tab w:val="left" w:pos="11908"/>
+          <w:tab w:val="left" w:pos="12824"/>
+          <w:tab w:val="left" w:pos="13740"/>
+          <w:tab w:val="left" w:pos="14656"/>
+        </w:tabs>
+        <w:rPr>
+          <w:rFonts w:asciiTheme="majorBidi" w:eastAsia="Times New Roman" w:hAnsiTheme="majorBidi" w:cstheme="majorBidi"/>
+          <w:color w:val="222222"/>
+          <w:sz w:val="24"/>
+          <w:szCs w:val="24"/>
+        </w:rPr>
+      </w:pPr>
+      <w:r>
+        <w:rPr>
+          <w:rFonts w:asciiTheme="majorBidi" w:eastAsia="Times New Roman" w:hAnsiTheme="majorBidi" w:cstheme="majorBidi"/>
+          <w:color w:val="222222"/>
+          <w:sz w:val="24"/>
+          <w:szCs w:val="24"/>
+        </w:rPr>
+        <w:t xml:space="preserve">The limitations and </w:t>
+      </w:r>
+      <w:r>
+        <w:rPr>
+          <w:rFonts w:asciiTheme="majorBidi" w:eastAsia="Times New Roman" w:hAnsiTheme="majorBidi" w:cstheme="majorBidi"/>
+          <w:color w:val="222222"/>
+          <w:sz w:val="24"/>
+          <w:szCs w:val="24"/>
+        </w:rPr>
+        <w:t>listed in the prior submission also still stand:</w:t>
+      </w:r>
+    </w:p>
+    <w:p>
+      <w:pPr>
         <w:pStyle w:val="ListParagraph"/>
         <w:numPr>
           <w:ilvl w:val="0"/>
@@ -974,7 +1017,23 @@
           <w:sz w:val="24"/>
           <w:szCs w:val="24"/>
         </w:rPr>
-        <w:t xml:space="preserve">We acknowledge that future energy prices may change the magnitude of reported hydropeaking values, lost value per day of steady low releases, and ecosystem budget </w:t>
+        <w:t>We acknowledge that future energy prices may change the magnitude of reported hydropeaking values, lost value per day of steady low releases, and ecosystem budget</w:t>
+      </w:r>
+      <w:r>
+        <w:rPr>
+          <w:rFonts w:asciiTheme="majorBidi" w:eastAsia="Times New Roman" w:hAnsiTheme="majorBidi" w:cstheme="majorBidi"/>
+          <w:sz w:val="24"/>
+          <w:szCs w:val="24"/>
+        </w:rPr>
+        <w:t>.</w:t>
+      </w:r>
+      <w:r>
+        <w:rPr>
+          <w:rFonts w:asciiTheme="majorBidi" w:eastAsia="Times New Roman" w:hAnsiTheme="majorBidi" w:cstheme="majorBidi"/>
+          <w:sz w:val="24"/>
+          <w:szCs w:val="24"/>
+        </w:rPr>
+        <w:t xml:space="preserve"> </w:t>
       </w:r>
     </w:p>
     <w:p>
@@ -2939,27 +2998,7 @@
           <w:sz w:val="24"/>
           <w:szCs w:val="24"/>
         </w:rPr>
-        <w:t>: (</w:t>
-      </w:r>
-      <w:proofErr w:type="spellStart"/>
-      <w:r>
-        <w:rPr>
-          <w:rFonts w:asciiTheme="majorBidi" w:eastAsia="Times New Roman" w:hAnsiTheme="majorBidi" w:cstheme="majorBidi"/>
-          <w:color w:val="7030A0"/>
-          <w:sz w:val="24"/>
-          <w:szCs w:val="24"/>
-        </w:rPr>
-        <w:t>i</w:t>
-      </w:r>
-      <w:proofErr w:type="spellEnd"/>
-      <w:r>
-        <w:rPr>
-          <w:rFonts w:asciiTheme="majorBidi" w:eastAsia="Times New Roman" w:hAnsiTheme="majorBidi" w:cstheme="majorBidi"/>
-          <w:color w:val="7030A0"/>
-          <w:sz w:val="24"/>
-          <w:szCs w:val="24"/>
-        </w:rPr>
-        <w:t xml:space="preserve">) </w:t>
+        <w:t xml:space="preserve">: (i) </w:t>
       </w:r>
       <w:r>
         <w:rPr>

</xml_diff>